<commit_message>
Aula 2: acrescenta a Parte 4 (plano educativo e 12 passos) e corrige formas cortadas e de baixa qualidade
Co-Authored-By: Claude Opus 5.5 <noreply@anthropic.com>
Claude-Session: https://claude.ai/code/session_01CGNjkhX1MBMVP1C2EddXzj
</commit_message>
<xml_diff>
--- a/apresentacoes/aula-2/roteiro-aula-2-integra.docx
+++ b/apresentacoes/aula-2/roteiro-aula-2-integra.docx
@@ -2,7 +2,7 @@
 <file path=word/document.xml><?xml version="1.0" encoding="utf-8"?>
 <w:document xmlns:w="http://schemas.openxmlformats.org/wordprocessingml/2006/main" xmlns:m="http://schemas.openxmlformats.org/officeDocument/2006/math" xmlns:r="http://schemas.openxmlformats.org/officeDocument/2006/relationships" xmlns:o="urn:schemas-microsoft-com:office:office" xmlns:v="urn:schemas-microsoft-com:vml" xmlns:w10="urn:schemas-microsoft-com:office:word" xmlns:a="http://schemas.openxmlformats.org/drawingml/2006/main" xmlns:pic="http://schemas.openxmlformats.org/drawingml/2006/picture" xmlns:wp="http://schemas.openxmlformats.org/drawingml/2006/wordprocessingDrawing">
   <w:body>
-    <w:bookmarkStart w:id="46" w:name="X6a9c4d63f5b53465427d9bc146896252374f03a"/>
+    <w:bookmarkStart w:id="63" w:name="X6a9c4d63f5b53465427d9bc146896252374f03a"/>
     <w:p>
       <w:pPr>
         <w:pStyle w:val="Heading1"/>
@@ -58,7 +58,7 @@
         <w:t xml:space="preserve"> </w:t>
       </w:r>
       <w:r>
-        <w:t xml:space="preserve">cerca de 32 min ·</w:t>
+        <w:t xml:space="preserve">cerca de 50 min ·</w:t>
       </w:r>
       <w:r>
         <w:t xml:space="preserve"> </w:t>
@@ -74,7 +74,7 @@
         <w:t xml:space="preserve"> </w:t>
       </w:r>
       <w:r>
-        <w:t xml:space="preserve">25</w:t>
+        <w:t xml:space="preserve">42</w:t>
       </w:r>
       <w:r>
         <w:t xml:space="preserve"> </w:t>
@@ -90,7 +90,7 @@
         <w:t xml:space="preserve"> </w:t>
       </w:r>
       <w:r>
-        <w:t xml:space="preserve">Aula 2 - Integra.pdf</w:t>
+        <w:t xml:space="preserve">Aula 2 - Integra.pdf (partes 1 e 2)</w:t>
       </w:r>
     </w:p>
     <w:tbl>
@@ -1041,7 +1041,7 @@
               <w:jc w:val="left"/>
             </w:pPr>
             <w:r>
-              <w:t xml:space="preserve">Educar com intenção</w:t>
+              <w:t xml:space="preserve">A casa que você quer construir</w:t>
             </w:r>
           </w:p>
         </w:tc>
@@ -1068,6 +1068,652 @@
             </w:pPr>
             <w:r>
               <w:t xml:space="preserve">25</w:t>
+            </w:r>
+          </w:p>
+        </w:tc>
+        <w:tc>
+          <w:tcPr/>
+          <w:p>
+            <w:pPr>
+              <w:pStyle w:val="Compact"/>
+              <w:jc w:val="left"/>
+            </w:pPr>
+            <w:r>
+              <w:t xml:space="preserve">Quais tijolos são importantes?</w:t>
+            </w:r>
+          </w:p>
+        </w:tc>
+        <w:tc>
+          <w:tcPr/>
+          <w:p>
+            <w:pPr>
+              <w:pStyle w:val="Compact"/>
+              <w:jc w:val="left"/>
+            </w:pPr>
+            <w:r>
+              <w:t xml:space="preserve">1 min 30 s</w:t>
+            </w:r>
+          </w:p>
+        </w:tc>
+      </w:tr>
+      <w:tr>
+        <w:tc>
+          <w:tcPr/>
+          <w:p>
+            <w:pPr>
+              <w:pStyle w:val="Compact"/>
+              <w:jc w:val="left"/>
+            </w:pPr>
+            <w:r>
+              <w:t xml:space="preserve">26</w:t>
+            </w:r>
+          </w:p>
+        </w:tc>
+        <w:tc>
+          <w:tcPr/>
+          <w:p>
+            <w:pPr>
+              <w:pStyle w:val="Compact"/>
+              <w:jc w:val="left"/>
+            </w:pPr>
+            <w:r>
+              <w:t xml:space="preserve">Uma rota, um plano educativo</w:t>
+            </w:r>
+          </w:p>
+        </w:tc>
+        <w:tc>
+          <w:tcPr/>
+          <w:p>
+            <w:pPr>
+              <w:pStyle w:val="Compact"/>
+              <w:jc w:val="left"/>
+            </w:pPr>
+            <w:r>
+              <w:t xml:space="preserve">1 min</w:t>
+            </w:r>
+          </w:p>
+        </w:tc>
+      </w:tr>
+      <w:tr>
+        <w:tc>
+          <w:tcPr/>
+          <w:p>
+            <w:pPr>
+              <w:pStyle w:val="Compact"/>
+              <w:jc w:val="left"/>
+            </w:pPr>
+            <w:r>
+              <w:t xml:space="preserve">27</w:t>
+            </w:r>
+          </w:p>
+        </w:tc>
+        <w:tc>
+          <w:tcPr/>
+          <w:p>
+            <w:pPr>
+              <w:pStyle w:val="Compact"/>
+              <w:jc w:val="left"/>
+            </w:pPr>
+            <w:r>
+              <w:t xml:space="preserve">Passo 1: corrigir rotas começa em nós</w:t>
+            </w:r>
+          </w:p>
+        </w:tc>
+        <w:tc>
+          <w:tcPr/>
+          <w:p>
+            <w:pPr>
+              <w:pStyle w:val="Compact"/>
+              <w:jc w:val="left"/>
+            </w:pPr>
+            <w:r>
+              <w:t xml:space="preserve">1 min 30 s</w:t>
+            </w:r>
+          </w:p>
+        </w:tc>
+      </w:tr>
+      <w:tr>
+        <w:tc>
+          <w:tcPr/>
+          <w:p>
+            <w:pPr>
+              <w:pStyle w:val="Compact"/>
+              <w:jc w:val="left"/>
+            </w:pPr>
+            <w:r>
+              <w:t xml:space="preserve">28</w:t>
+            </w:r>
+          </w:p>
+        </w:tc>
+        <w:tc>
+          <w:tcPr/>
+          <w:p>
+            <w:pPr>
+              <w:pStyle w:val="Compact"/>
+              <w:jc w:val="left"/>
+            </w:pPr>
+            <w:r>
+              <w:t xml:space="preserve">A mudança começa em você</w:t>
+            </w:r>
+          </w:p>
+        </w:tc>
+        <w:tc>
+          <w:tcPr/>
+          <w:p>
+            <w:pPr>
+              <w:pStyle w:val="Compact"/>
+              <w:jc w:val="left"/>
+            </w:pPr>
+            <w:r>
+              <w:t xml:space="preserve">1 min</w:t>
+            </w:r>
+          </w:p>
+        </w:tc>
+      </w:tr>
+      <w:tr>
+        <w:tc>
+          <w:tcPr/>
+          <w:p>
+            <w:pPr>
+              <w:pStyle w:val="Compact"/>
+              <w:jc w:val="left"/>
+            </w:pPr>
+            <w:r>
+              <w:t xml:space="preserve">29</w:t>
+            </w:r>
+          </w:p>
+        </w:tc>
+        <w:tc>
+          <w:tcPr/>
+          <w:p>
+            <w:pPr>
+              <w:pStyle w:val="Compact"/>
+              <w:jc w:val="left"/>
+            </w:pPr>
+            <w:r>
+              <w:t xml:space="preserve">Passo 2: uma família funcional</w:t>
+            </w:r>
+          </w:p>
+        </w:tc>
+        <w:tc>
+          <w:tcPr/>
+          <w:p>
+            <w:pPr>
+              <w:pStyle w:val="Compact"/>
+              <w:jc w:val="left"/>
+            </w:pPr>
+            <w:r>
+              <w:t xml:space="preserve">1 min 30 s</w:t>
+            </w:r>
+          </w:p>
+        </w:tc>
+      </w:tr>
+      <w:tr>
+        <w:tc>
+          <w:tcPr/>
+          <w:p>
+            <w:pPr>
+              <w:pStyle w:val="Compact"/>
+              <w:jc w:val="left"/>
+            </w:pPr>
+            <w:r>
+              <w:t xml:space="preserve">30</w:t>
+            </w:r>
+          </w:p>
+        </w:tc>
+        <w:tc>
+          <w:tcPr/>
+          <w:p>
+            <w:pPr>
+              <w:pStyle w:val="Compact"/>
+              <w:jc w:val="left"/>
+            </w:pPr>
+            <w:r>
+              <w:t xml:space="preserve">Passo 3: seja exemplo</w:t>
+            </w:r>
+          </w:p>
+        </w:tc>
+        <w:tc>
+          <w:tcPr/>
+          <w:p>
+            <w:pPr>
+              <w:pStyle w:val="Compact"/>
+              <w:jc w:val="left"/>
+            </w:pPr>
+            <w:r>
+              <w:t xml:space="preserve">1 min</w:t>
+            </w:r>
+          </w:p>
+        </w:tc>
+      </w:tr>
+      <w:tr>
+        <w:tc>
+          <w:tcPr/>
+          <w:p>
+            <w:pPr>
+              <w:pStyle w:val="Compact"/>
+              <w:jc w:val="left"/>
+            </w:pPr>
+            <w:r>
+              <w:t xml:space="preserve">31</w:t>
+            </w:r>
+          </w:p>
+        </w:tc>
+        <w:tc>
+          <w:tcPr/>
+          <w:p>
+            <w:pPr>
+              <w:pStyle w:val="Compact"/>
+              <w:jc w:val="left"/>
+            </w:pPr>
+            <w:r>
+              <w:t xml:space="preserve">Passo 4: tempo de qualidade</w:t>
+            </w:r>
+          </w:p>
+        </w:tc>
+        <w:tc>
+          <w:tcPr/>
+          <w:p>
+            <w:pPr>
+              <w:pStyle w:val="Compact"/>
+              <w:jc w:val="left"/>
+            </w:pPr>
+            <w:r>
+              <w:t xml:space="preserve">1 min</w:t>
+            </w:r>
+          </w:p>
+        </w:tc>
+      </w:tr>
+      <w:tr>
+        <w:tc>
+          <w:tcPr/>
+          <w:p>
+            <w:pPr>
+              <w:pStyle w:val="Compact"/>
+              <w:jc w:val="left"/>
+            </w:pPr>
+            <w:r>
+              <w:t xml:space="preserve">32</w:t>
+            </w:r>
+          </w:p>
+        </w:tc>
+        <w:tc>
+          <w:tcPr/>
+          <w:p>
+            <w:pPr>
+              <w:pStyle w:val="Compact"/>
+              <w:jc w:val="left"/>
+            </w:pPr>
+            <w:r>
+              <w:t xml:space="preserve">Passo 5: comunicação com clareza e amor</w:t>
+            </w:r>
+          </w:p>
+        </w:tc>
+        <w:tc>
+          <w:tcPr/>
+          <w:p>
+            <w:pPr>
+              <w:pStyle w:val="Compact"/>
+              <w:jc w:val="left"/>
+            </w:pPr>
+            <w:r>
+              <w:t xml:space="preserve">1 min</w:t>
+            </w:r>
+          </w:p>
+        </w:tc>
+      </w:tr>
+      <w:tr>
+        <w:tc>
+          <w:tcPr/>
+          <w:p>
+            <w:pPr>
+              <w:pStyle w:val="Compact"/>
+              <w:jc w:val="left"/>
+            </w:pPr>
+            <w:r>
+              <w:t xml:space="preserve">33</w:t>
+            </w:r>
+          </w:p>
+        </w:tc>
+        <w:tc>
+          <w:tcPr/>
+          <w:p>
+            <w:pPr>
+              <w:pStyle w:val="Compact"/>
+              <w:jc w:val="left"/>
+            </w:pPr>
+            <w:r>
+              <w:t xml:space="preserve">Passo 6: regras e limites consistentes</w:t>
+            </w:r>
+          </w:p>
+        </w:tc>
+        <w:tc>
+          <w:tcPr/>
+          <w:p>
+            <w:pPr>
+              <w:pStyle w:val="Compact"/>
+              <w:jc w:val="left"/>
+            </w:pPr>
+            <w:r>
+              <w:t xml:space="preserve">1 min</w:t>
+            </w:r>
+          </w:p>
+        </w:tc>
+      </w:tr>
+      <w:tr>
+        <w:tc>
+          <w:tcPr/>
+          <w:p>
+            <w:pPr>
+              <w:pStyle w:val="Compact"/>
+              <w:jc w:val="left"/>
+            </w:pPr>
+            <w:r>
+              <w:t xml:space="preserve">34</w:t>
+            </w:r>
+          </w:p>
+        </w:tc>
+        <w:tc>
+          <w:tcPr/>
+          <w:p>
+            <w:pPr>
+              <w:pStyle w:val="Compact"/>
+              <w:jc w:val="left"/>
+            </w:pPr>
+            <w:r>
+              <w:t xml:space="preserve">Passo 7: gratidão e autorresponsabilidade</w:t>
+            </w:r>
+          </w:p>
+        </w:tc>
+        <w:tc>
+          <w:tcPr/>
+          <w:p>
+            <w:pPr>
+              <w:pStyle w:val="Compact"/>
+              <w:jc w:val="left"/>
+            </w:pPr>
+            <w:r>
+              <w:t xml:space="preserve">1 min</w:t>
+            </w:r>
+          </w:p>
+        </w:tc>
+      </w:tr>
+      <w:tr>
+        <w:tc>
+          <w:tcPr/>
+          <w:p>
+            <w:pPr>
+              <w:pStyle w:val="Compact"/>
+              <w:jc w:val="left"/>
+            </w:pPr>
+            <w:r>
+              <w:t xml:space="preserve">35</w:t>
+            </w:r>
+          </w:p>
+        </w:tc>
+        <w:tc>
+          <w:tcPr/>
+          <w:p>
+            <w:pPr>
+              <w:pStyle w:val="Compact"/>
+              <w:jc w:val="left"/>
+            </w:pPr>
+            <w:r>
+              <w:t xml:space="preserve">Passo 8: autoestima e identidade</w:t>
+            </w:r>
+          </w:p>
+        </w:tc>
+        <w:tc>
+          <w:tcPr/>
+          <w:p>
+            <w:pPr>
+              <w:pStyle w:val="Compact"/>
+              <w:jc w:val="left"/>
+            </w:pPr>
+            <w:r>
+              <w:t xml:space="preserve">1 min</w:t>
+            </w:r>
+          </w:p>
+        </w:tc>
+      </w:tr>
+      <w:tr>
+        <w:tc>
+          <w:tcPr/>
+          <w:p>
+            <w:pPr>
+              <w:pStyle w:val="Compact"/>
+              <w:jc w:val="left"/>
+            </w:pPr>
+            <w:r>
+              <w:t xml:space="preserve">36</w:t>
+            </w:r>
+          </w:p>
+        </w:tc>
+        <w:tc>
+          <w:tcPr/>
+          <w:p>
+            <w:pPr>
+              <w:pStyle w:val="Compact"/>
+              <w:jc w:val="left"/>
+            </w:pPr>
+            <w:r>
+              <w:t xml:space="preserve">Passo 9: amor todos os dias</w:t>
+            </w:r>
+          </w:p>
+        </w:tc>
+        <w:tc>
+          <w:tcPr/>
+          <w:p>
+            <w:pPr>
+              <w:pStyle w:val="Compact"/>
+              <w:jc w:val="left"/>
+            </w:pPr>
+            <w:r>
+              <w:t xml:space="preserve">1 min</w:t>
+            </w:r>
+          </w:p>
+        </w:tc>
+      </w:tr>
+      <w:tr>
+        <w:tc>
+          <w:tcPr/>
+          <w:p>
+            <w:pPr>
+              <w:pStyle w:val="Compact"/>
+              <w:jc w:val="left"/>
+            </w:pPr>
+            <w:r>
+              <w:t xml:space="preserve">37</w:t>
+            </w:r>
+          </w:p>
+        </w:tc>
+        <w:tc>
+          <w:tcPr/>
+          <w:p>
+            <w:pPr>
+              <w:pStyle w:val="Compact"/>
+              <w:jc w:val="left"/>
+            </w:pPr>
+            <w:r>
+              <w:t xml:space="preserve">Passo 10: resiliência e mentalidade de crescimento</w:t>
+            </w:r>
+          </w:p>
+        </w:tc>
+        <w:tc>
+          <w:tcPr/>
+          <w:p>
+            <w:pPr>
+              <w:pStyle w:val="Compact"/>
+              <w:jc w:val="left"/>
+            </w:pPr>
+            <w:r>
+              <w:t xml:space="preserve">1 min</w:t>
+            </w:r>
+          </w:p>
+        </w:tc>
+      </w:tr>
+      <w:tr>
+        <w:tc>
+          <w:tcPr/>
+          <w:p>
+            <w:pPr>
+              <w:pStyle w:val="Compact"/>
+              <w:jc w:val="left"/>
+            </w:pPr>
+            <w:r>
+              <w:t xml:space="preserve">38</w:t>
+            </w:r>
+          </w:p>
+        </w:tc>
+        <w:tc>
+          <w:tcPr/>
+          <w:p>
+            <w:pPr>
+              <w:pStyle w:val="Compact"/>
+              <w:jc w:val="left"/>
+            </w:pPr>
+            <w:r>
+              <w:t xml:space="preserve">Passo 11: sonhos e metas</w:t>
+            </w:r>
+          </w:p>
+        </w:tc>
+        <w:tc>
+          <w:tcPr/>
+          <w:p>
+            <w:pPr>
+              <w:pStyle w:val="Compact"/>
+              <w:jc w:val="left"/>
+            </w:pPr>
+            <w:r>
+              <w:t xml:space="preserve">1 min</w:t>
+            </w:r>
+          </w:p>
+        </w:tc>
+      </w:tr>
+      <w:tr>
+        <w:tc>
+          <w:tcPr/>
+          <w:p>
+            <w:pPr>
+              <w:pStyle w:val="Compact"/>
+              <w:jc w:val="left"/>
+            </w:pPr>
+            <w:r>
+              <w:t xml:space="preserve">39</w:t>
+            </w:r>
+          </w:p>
+        </w:tc>
+        <w:tc>
+          <w:tcPr/>
+          <w:p>
+            <w:pPr>
+              <w:pStyle w:val="Compact"/>
+              <w:jc w:val="left"/>
+            </w:pPr>
+            <w:r>
+              <w:t xml:space="preserve">Passo 12: propósito e espiritualidade</w:t>
+            </w:r>
+          </w:p>
+        </w:tc>
+        <w:tc>
+          <w:tcPr/>
+          <w:p>
+            <w:pPr>
+              <w:pStyle w:val="Compact"/>
+              <w:jc w:val="left"/>
+            </w:pPr>
+            <w:r>
+              <w:t xml:space="preserve">1 min 30 s</w:t>
+            </w:r>
+          </w:p>
+        </w:tc>
+      </w:tr>
+      <w:tr>
+        <w:tc>
+          <w:tcPr/>
+          <w:p>
+            <w:pPr>
+              <w:pStyle w:val="Compact"/>
+              <w:jc w:val="left"/>
+            </w:pPr>
+            <w:r>
+              <w:t xml:space="preserve">40</w:t>
+            </w:r>
+          </w:p>
+        </w:tc>
+        <w:tc>
+          <w:tcPr/>
+          <w:p>
+            <w:pPr>
+              <w:pStyle w:val="Compact"/>
+              <w:jc w:val="left"/>
+            </w:pPr>
+            <w:r>
+              <w:t xml:space="preserve">A gaiola</w:t>
+            </w:r>
+          </w:p>
+        </w:tc>
+        <w:tc>
+          <w:tcPr/>
+          <w:p>
+            <w:pPr>
+              <w:pStyle w:val="Compact"/>
+              <w:jc w:val="left"/>
+            </w:pPr>
+            <w:r>
+              <w:t xml:space="preserve">1 min 30 s</w:t>
+            </w:r>
+          </w:p>
+        </w:tc>
+      </w:tr>
+      <w:tr>
+        <w:tc>
+          <w:tcPr/>
+          <w:p>
+            <w:pPr>
+              <w:pStyle w:val="Compact"/>
+              <w:jc w:val="left"/>
+            </w:pPr>
+            <w:r>
+              <w:t xml:space="preserve">41</w:t>
+            </w:r>
+          </w:p>
+        </w:tc>
+        <w:tc>
+          <w:tcPr/>
+          <w:p>
+            <w:pPr>
+              <w:pStyle w:val="Compact"/>
+              <w:jc w:val="left"/>
+            </w:pPr>
+            <w:r>
+              <w:t xml:space="preserve">Educar com intenção</w:t>
+            </w:r>
+          </w:p>
+        </w:tc>
+        <w:tc>
+          <w:tcPr/>
+          <w:p>
+            <w:pPr>
+              <w:pStyle w:val="Compact"/>
+              <w:jc w:val="left"/>
+            </w:pPr>
+            <w:r>
+              <w:t xml:space="preserve">1 min</w:t>
+            </w:r>
+          </w:p>
+        </w:tc>
+      </w:tr>
+      <w:tr>
+        <w:tc>
+          <w:tcPr/>
+          <w:p>
+            <w:pPr>
+              <w:pStyle w:val="Compact"/>
+              <w:jc w:val="left"/>
+            </w:pPr>
+            <w:r>
+              <w:t xml:space="preserve">42</w:t>
             </w:r>
           </w:p>
         </w:tc>
@@ -3350,7 +3996,7 @@
         <w:t xml:space="preserve"> </w:t>
       </w:r>
       <w:r>
-        <w:t xml:space="preserve">E para encerrar, uma frase para guardar.</w:t>
+        <w:t xml:space="preserve">E se queremos ser embaixadores, precisamos de um projeto. Vamos construir?</w:t>
       </w:r>
     </w:p>
     <w:p>
@@ -3361,13 +4007,13 @@
       </w:r>
     </w:p>
     <w:bookmarkEnd w:id="42"/>
-    <w:bookmarkStart w:id="43" w:name="slide-24-educar-com-intenção-1-min"/>
+    <w:bookmarkStart w:id="43" w:name="X0540ca0c9efe0f8d7817eb529f4229c49e0ed4a"/>
     <w:p>
       <w:pPr>
         <w:pStyle w:val="Heading2"/>
       </w:pPr>
       <w:r>
-        <w:t xml:space="preserve">Slide 24 — Educar com intenção · ⏱ 1 min</w:t>
+        <w:t xml:space="preserve">Slide 24 — A casa que você quer construir · ⏱ 1 min</w:t>
       </w:r>
     </w:p>
     <w:p>
@@ -3385,7 +4031,7 @@
         <w:t xml:space="preserve"> </w:t>
       </w:r>
       <w:r>
-        <w:t xml:space="preserve">fechar com a mensagem principal e um compromisso prático.</w:t>
+        <w:t xml:space="preserve">abrir a Parte 4 com a metáfora da construção.</w:t>
       </w:r>
     </w:p>
     <w:p>
@@ -3403,13 +4049,13 @@
         <w:t xml:space="preserve"> </w:t>
       </w:r>
       <w:r>
-        <w:t xml:space="preserve">- Retomar: presença, filtro, limite</w:t>
-      </w:r>
-      <w:r>
-        <w:t xml:space="preserve"> </w:t>
-      </w:r>
-      <w:r>
-        <w:t xml:space="preserve">- Compromisso da semana: um momento intencional por dia</w:t>
+        <w:t xml:space="preserve">- Toda casa bonita começou com um projeto</w:t>
+      </w:r>
+      <w:r>
+        <w:t xml:space="preserve"> </w:t>
+      </w:r>
+      <w:r>
+        <w:t xml:space="preserve">- Educar também é construir: precisa de plano</w:t>
       </w:r>
     </w:p>
     <w:p>
@@ -3427,7 +4073,7 @@
         <w:t xml:space="preserve"> </w:t>
       </w:r>
       <w:r>
-        <w:t xml:space="preserve">Educar com intenção é escolher estar presente. Hoje falamos de três coisas: estar presente de verdade, ser o filtro do que chega até nossos filhos e usar o limite como amor. O meu convite para esta semana é simples: escolha um momento por dia, sem tela, só seu e do seu filho. Pequeno, mas intencional. Muito obrigada pela presença de vocês.</w:t>
+        <w:t xml:space="preserve">Olhem essa casa. Ninguém constrói uma casa assim por acaso. Antes do primeiro tijolo existe um projeto, alguém que pensou onde fica cada parede. Com a família é igual. Chegamos à última parte do nosso encontro: o plano educativo. Vamos pensar juntos em como construir, de propósito, o lar que queremos.</w:t>
       </w:r>
     </w:p>
     <w:p>
@@ -3445,7 +4091,7 @@
         <w:t xml:space="preserve"> </w:t>
       </w:r>
       <w:r>
-        <w:t xml:space="preserve">E continuem com a gente nas redes.</w:t>
+        <w:t xml:space="preserve">E toda construção começa por uma pergunta.</w:t>
       </w:r>
     </w:p>
     <w:p>
@@ -3456,13 +4102,13 @@
       </w:r>
     </w:p>
     <w:bookmarkEnd w:id="43"/>
-    <w:bookmarkStart w:id="44" w:name="slide-25-contato-30-s"/>
+    <w:bookmarkStart w:id="44" w:name="X6876b4792930fb10f74e58e47e7aae50de99a26"/>
     <w:p>
       <w:pPr>
         <w:pStyle w:val="Heading2"/>
       </w:pPr>
       <w:r>
-        <w:t xml:space="preserve">Slide 25 — Contato · ⏱ 30 s</w:t>
+        <w:t xml:space="preserve">Slide 25 — Quais tijolos são importantes? · ⏱ 1 min 30 s</w:t>
       </w:r>
     </w:p>
     <w:p>
@@ -3480,7 +4126,7 @@
         <w:t xml:space="preserve"> </w:t>
       </w:r>
       <w:r>
-        <w:t xml:space="preserve">levar os pais a acompanhar a INTEGRA.</w:t>
+        <w:t xml:space="preserve">levar os pais a pensar nos valores que querem ver no filho.</w:t>
       </w:r>
     </w:p>
     <w:p>
@@ -3498,25 +4144,19 @@
         <w:t xml:space="preserve"> </w:t>
       </w:r>
       <w:r>
-        <w:t xml:space="preserve">- Instagram</w:t>
-      </w:r>
-      <w:r>
-        <w:t xml:space="preserve"> </w:t>
-      </w:r>
-      <w:r>
-        <w:t xml:space="preserve">@integra_escoladepais</w:t>
-      </w:r>
-      <w:r>
-        <w:t xml:space="preserve"> </w:t>
-      </w:r>
-      <w:r>
-        <w:t xml:space="preserve">(QR code)</w:t>
-      </w:r>
-      <w:r>
-        <w:t xml:space="preserve"> </w:t>
-      </w:r>
-      <w:r>
-        <w:t xml:space="preserve">- WhatsApp e e-mail</w:t>
+        <w:t xml:space="preserve">- Cada valor é um tijolo</w:t>
+      </w:r>
+      <w:r>
+        <w:t xml:space="preserve"> </w:t>
+      </w:r>
+      <w:r>
+        <w:t xml:space="preserve">- Pergunta à plateia: quais tijolos você quer na vida do seu filho?</w:t>
+      </w:r>
+      <w:r>
+        <w:t xml:space="preserve"> </w:t>
+      </w:r>
+      <w:r>
+        <w:t xml:space="preserve">- Ouvir duas ou três respostas</w:t>
       </w:r>
     </w:p>
     <w:p>
@@ -3534,16 +4174,7 @@
         <w:t xml:space="preserve"> </w:t>
       </w:r>
       <w:r>
-        <w:t xml:space="preserve">Quem quiser continuar a conversa, nos siga no Instagram,</w:t>
-      </w:r>
-      <w:r>
-        <w:t xml:space="preserve"> </w:t>
-      </w:r>
-      <w:r>
-        <w:t xml:space="preserve">@integra_escoladepais</w:t>
-      </w:r>
-      <w:r>
-        <w:t xml:space="preserve">. É só apontar a câmera para o QR code. O WhatsApp e o e-mail estão aqui também. Até a próxima aula!</w:t>
+        <w:t xml:space="preserve">Se a vida do seu filho fosse uma casa, quais tijolos não poderiam faltar? Respeito, honestidade, fé, responsabilidade, carinho? Eu queria ouvir vocês: qual é o tijolo mais importante para a sua família? Cada resposta aqui é um valor que a gente coloca, ou deixa de colocar, todos os dias.</w:t>
       </w:r>
     </w:p>
     <w:p>
@@ -3561,7 +4192,7 @@
         <w:t xml:space="preserve"> </w:t>
       </w:r>
       <w:r>
-        <w:t xml:space="preserve">Mensagem final: um momento intencional por dia, sem tela, só você e seu filho.</w:t>
+        <w:t xml:space="preserve">E para colocar esses tijolos no lugar certo, a gente precisa de um caminho.</w:t>
       </w:r>
     </w:p>
     <w:p>
@@ -3572,7 +4203,1778 @@
       </w:r>
     </w:p>
     <w:bookmarkEnd w:id="44"/>
-    <w:bookmarkStart w:id="45" w:name="preparação-para-perguntas"/>
+    <w:bookmarkStart w:id="45" w:name="X328a15c9f266b3b81bf7d63f1716fbc5aa6c932"/>
+    <w:p>
+      <w:pPr>
+        <w:pStyle w:val="Heading2"/>
+      </w:pPr>
+      <w:r>
+        <w:t xml:space="preserve">Slide 26 — Uma rota, um plano educativo · ⏱ 1 min</w:t>
+      </w:r>
+    </w:p>
+    <w:p>
+      <w:pPr>
+        <w:pStyle w:val="FirstParagraph"/>
+      </w:pPr>
+      <w:r>
+        <w:rPr>
+          <w:bCs/>
+          <w:b/>
+        </w:rPr>
+        <w:t xml:space="preserve">Objetivo:</w:t>
+      </w:r>
+      <w:r>
+        <w:t xml:space="preserve"> </w:t>
+      </w:r>
+      <w:r>
+        <w:t xml:space="preserve">apresentar a ideia de plano educativo.</w:t>
+      </w:r>
+    </w:p>
+    <w:p>
+      <w:pPr>
+        <w:pStyle w:val="BodyText"/>
+      </w:pPr>
+      <w:r>
+        <w:rPr>
+          <w:bCs/>
+          <w:b/>
+        </w:rPr>
+        <w:t xml:space="preserve">Abordar:</w:t>
+      </w:r>
+      <w:r>
+        <w:t xml:space="preserve"> </w:t>
+      </w:r>
+      <w:r>
+        <w:t xml:space="preserve">- Sem rota, a gente só reage</w:t>
+      </w:r>
+      <w:r>
+        <w:t xml:space="preserve"> </w:t>
+      </w:r>
+      <w:r>
+        <w:t xml:space="preserve">- O plano dá direção para o dia a dia</w:t>
+      </w:r>
+    </w:p>
+    <w:p>
+      <w:pPr>
+        <w:pStyle w:val="BodyText"/>
+      </w:pPr>
+      <w:r>
+        <w:rPr>
+          <w:bCs/>
+          <w:b/>
+        </w:rPr>
+        <w:t xml:space="preserve">Fala sugerida:</w:t>
+      </w:r>
+      <w:r>
+        <w:t xml:space="preserve"> </w:t>
+      </w:r>
+      <w:r>
+        <w:t xml:space="preserve">É preciso criar uma rota, um plano educativo. Quando a gente sai de casa sem saber para onde vai, qualquer caminho serve, e normalmente é o mais fácil. Com os filhos é assim: sem plano, educamos no improviso, apagando incêndios, como vimos há pouco. Vou mostrar agora doze passos para construir essa rota.</w:t>
+      </w:r>
+    </w:p>
+    <w:p>
+      <w:pPr>
+        <w:pStyle w:val="BodyText"/>
+      </w:pPr>
+      <w:r>
+        <w:rPr>
+          <w:bCs/>
+          <w:b/>
+        </w:rPr>
+        <w:t xml:space="preserve">Transição:</w:t>
+      </w:r>
+      <w:r>
+        <w:t xml:space="preserve"> </w:t>
+      </w:r>
+      <w:r>
+        <w:t xml:space="preserve">E o primeiro passo não é sobre o seu filho. É sobre você.</w:t>
+      </w:r>
+    </w:p>
+    <w:p>
+      <w:r>
+        <w:pict>
+          <v:rect style="width:0;height:1.5pt" o:hralign="center" o:hrstd="t" o:hr="t"/>
+        </w:pict>
+      </w:r>
+    </w:p>
+    <w:bookmarkEnd w:id="45"/>
+    <w:bookmarkStart w:id="46" w:name="Xd220d61c25e4b988fa1448ee68ea2d498618a42"/>
+    <w:p>
+      <w:pPr>
+        <w:pStyle w:val="Heading2"/>
+      </w:pPr>
+      <w:r>
+        <w:t xml:space="preserve">Slide 27 — Passo 1: corrigir rotas começa em nós · ⏱ 1 min 30 s</w:t>
+      </w:r>
+    </w:p>
+    <w:p>
+      <w:pPr>
+        <w:pStyle w:val="FirstParagraph"/>
+      </w:pPr>
+      <w:r>
+        <w:rPr>
+          <w:bCs/>
+          <w:b/>
+        </w:rPr>
+        <w:t xml:space="preserve">Objetivo:</w:t>
+      </w:r>
+      <w:r>
+        <w:t xml:space="preserve"> </w:t>
+      </w:r>
+      <w:r>
+        <w:t xml:space="preserve">mostrar que a mudança começa pelos pais.</w:t>
+      </w:r>
+    </w:p>
+    <w:p>
+      <w:pPr>
+        <w:pStyle w:val="BodyText"/>
+      </w:pPr>
+      <w:r>
+        <w:rPr>
+          <w:bCs/>
+          <w:b/>
+        </w:rPr>
+        <w:t xml:space="preserve">Abordar:</w:t>
+      </w:r>
+      <w:r>
+        <w:t xml:space="preserve"> </w:t>
+      </w:r>
+      <w:r>
+        <w:t xml:space="preserve">- Errar o caminho faz parte; corrigir também</w:t>
+      </w:r>
+      <w:r>
+        <w:t xml:space="preserve"> </w:t>
+      </w:r>
+      <w:r>
+        <w:t xml:space="preserve">- A correção começa no adulto, não na criança</w:t>
+      </w:r>
+    </w:p>
+    <w:p>
+      <w:pPr>
+        <w:pStyle w:val="BodyText"/>
+      </w:pPr>
+      <w:r>
+        <w:rPr>
+          <w:bCs/>
+          <w:b/>
+        </w:rPr>
+        <w:t xml:space="preserve">Fala sugerida:</w:t>
+      </w:r>
+      <w:r>
+        <w:t xml:space="preserve"> </w:t>
+      </w:r>
+      <w:r>
+        <w:t xml:space="preserve">Passo um: é preciso corrigir rotas, e essa correção de rotas começa em nós. É muito comum querer que o filho mude: que grite menos, que obedeça mais, que largue o celular. Mas a pergunta é: o que eu preciso mudar em mim primeiro? Corrigir rota não é sinal de fracasso, é sinal de quem está prestando atenção no caminho.</w:t>
+      </w:r>
+    </w:p>
+    <w:p>
+      <w:pPr>
+        <w:pStyle w:val="BodyText"/>
+      </w:pPr>
+      <w:r>
+        <w:rPr>
+          <w:bCs/>
+          <w:b/>
+        </w:rPr>
+        <w:t xml:space="preserve">Transição:</w:t>
+      </w:r>
+      <w:r>
+        <w:t xml:space="preserve"> </w:t>
+      </w:r>
+      <w:r>
+        <w:t xml:space="preserve">E isso vale para a casa inteira.</w:t>
+      </w:r>
+    </w:p>
+    <w:p>
+      <w:r>
+        <w:pict>
+          <v:rect style="width:0;height:1.5pt" o:hralign="center" o:hrstd="t" o:hr="t"/>
+        </w:pict>
+      </w:r>
+    </w:p>
+    <w:bookmarkEnd w:id="46"/>
+    <w:bookmarkStart w:id="47" w:name="slide-28-a-mudança-começa-em-você-1-min"/>
+    <w:p>
+      <w:pPr>
+        <w:pStyle w:val="Heading2"/>
+      </w:pPr>
+      <w:r>
+        <w:t xml:space="preserve">Slide 28 — A mudança começa em você · ⏱ 1 min</w:t>
+      </w:r>
+    </w:p>
+    <w:p>
+      <w:pPr>
+        <w:pStyle w:val="FirstParagraph"/>
+      </w:pPr>
+      <w:r>
+        <w:rPr>
+          <w:bCs/>
+          <w:b/>
+        </w:rPr>
+        <w:t xml:space="preserve">Objetivo:</w:t>
+      </w:r>
+      <w:r>
+        <w:t xml:space="preserve"> </w:t>
+      </w:r>
+      <w:r>
+        <w:t xml:space="preserve">reforçar a responsabilidade pessoal como ponto de partida.</w:t>
+      </w:r>
+    </w:p>
+    <w:p>
+      <w:pPr>
+        <w:pStyle w:val="BodyText"/>
+      </w:pPr>
+      <w:r>
+        <w:rPr>
+          <w:bCs/>
+          <w:b/>
+        </w:rPr>
+        <w:t xml:space="preserve">Abordar:</w:t>
+      </w:r>
+      <w:r>
+        <w:t xml:space="preserve"> </w:t>
+      </w:r>
+      <w:r>
+        <w:t xml:space="preserve">- A casa muda quando um adulto muda</w:t>
+      </w:r>
+      <w:r>
+        <w:t xml:space="preserve"> </w:t>
+      </w:r>
+      <w:r>
+        <w:t xml:space="preserve">- Pequenas mudanças já mexem com toda a família</w:t>
+      </w:r>
+    </w:p>
+    <w:p>
+      <w:pPr>
+        <w:pStyle w:val="BodyText"/>
+      </w:pPr>
+      <w:r>
+        <w:rPr>
+          <w:bCs/>
+          <w:b/>
+        </w:rPr>
+        <w:t xml:space="preserve">Fala sugerida:</w:t>
+      </w:r>
+      <w:r>
+        <w:t xml:space="preserve"> </w:t>
+      </w:r>
+      <w:r>
+        <w:t xml:space="preserve">A mudança que você deseja na sua casa, na sua família, no seu lar começa em você. Quando um adulto muda o tom de voz, a família inteira sente. Quando o pai ou a mãe chega mais presente, o clima da casa muda. Você não precisa esperar ninguém para começar.</w:t>
+      </w:r>
+    </w:p>
+    <w:p>
+      <w:pPr>
+        <w:pStyle w:val="BodyText"/>
+      </w:pPr>
+      <w:r>
+        <w:rPr>
+          <w:bCs/>
+          <w:b/>
+        </w:rPr>
+        <w:t xml:space="preserve">Transição:</w:t>
+      </w:r>
+      <w:r>
+        <w:t xml:space="preserve"> </w:t>
+      </w:r>
+      <w:r>
+        <w:t xml:space="preserve">E quando os adultos mudam, a família inteira ganha.</w:t>
+      </w:r>
+    </w:p>
+    <w:p>
+      <w:r>
+        <w:pict>
+          <v:rect style="width:0;height:1.5pt" o:hralign="center" o:hrstd="t" o:hr="t"/>
+        </w:pict>
+      </w:r>
+    </w:p>
+    <w:bookmarkEnd w:id="47"/>
+    <w:bookmarkStart w:id="48" w:name="X92b5cd9355792c8ba6d649d6f3702612b6d873a"/>
+    <w:p>
+      <w:pPr>
+        <w:pStyle w:val="Heading2"/>
+      </w:pPr>
+      <w:r>
+        <w:t xml:space="preserve">Slide 29 — Passo 2: uma família funcional · ⏱ 1 min 30 s</w:t>
+      </w:r>
+    </w:p>
+    <w:p>
+      <w:pPr>
+        <w:pStyle w:val="FirstParagraph"/>
+      </w:pPr>
+      <w:r>
+        <w:rPr>
+          <w:bCs/>
+          <w:b/>
+        </w:rPr>
+        <w:t xml:space="preserve">Objetivo:</w:t>
+      </w:r>
+      <w:r>
+        <w:t xml:space="preserve"> </w:t>
+      </w:r>
+      <w:r>
+        <w:t xml:space="preserve">mostrar o valor de um lar estruturado para a criança.</w:t>
+      </w:r>
+    </w:p>
+    <w:p>
+      <w:pPr>
+        <w:pStyle w:val="BodyText"/>
+      </w:pPr>
+      <w:r>
+        <w:rPr>
+          <w:bCs/>
+          <w:b/>
+        </w:rPr>
+        <w:t xml:space="preserve">Abordar:</w:t>
+      </w:r>
+      <w:r>
+        <w:t xml:space="preserve"> </w:t>
+      </w:r>
+      <w:r>
+        <w:t xml:space="preserve">- Família funcional é o maior presente</w:t>
+      </w:r>
+      <w:r>
+        <w:t xml:space="preserve"> </w:t>
+      </w:r>
+      <w:r>
+        <w:t xml:space="preserve">- Lar estruturado traz segurança, inteligência emocional e confiança</w:t>
+      </w:r>
+      <w:r>
+        <w:t xml:space="preserve"> </w:t>
+      </w:r>
+      <w:r>
+        <w:t xml:space="preserve">- Funcional não é perfeita</w:t>
+      </w:r>
+    </w:p>
+    <w:p>
+      <w:pPr>
+        <w:pStyle w:val="BodyText"/>
+      </w:pPr>
+      <w:r>
+        <w:rPr>
+          <w:bCs/>
+          <w:b/>
+        </w:rPr>
+        <w:t xml:space="preserve">Fala sugerida:</w:t>
+      </w:r>
+      <w:r>
+        <w:t xml:space="preserve"> </w:t>
+      </w:r>
+      <w:r>
+        <w:t xml:space="preserve">Passo dois: uma família funcional é o maior presente que você pode dar aos seus filhos. A criança que cresce em um lar estruturado se sente segura, desenvolve inteligência emocional e aprende a enfrentar a vida com confiança. E atenção: funcional não é perfeita. É uma família que tem rotina, combinados, conversa e que sabe se reconciliar depois de um conflito.</w:t>
+      </w:r>
+    </w:p>
+    <w:p>
+      <w:pPr>
+        <w:pStyle w:val="BodyText"/>
+      </w:pPr>
+      <w:r>
+        <w:rPr>
+          <w:bCs/>
+          <w:b/>
+        </w:rPr>
+        <w:t xml:space="preserve">Transição:</w:t>
+      </w:r>
+      <w:r>
+        <w:t xml:space="preserve"> </w:t>
+      </w:r>
+      <w:r>
+        <w:t xml:space="preserve">E a forma mais forte de estruturar a casa é a próxima.</w:t>
+      </w:r>
+    </w:p>
+    <w:p>
+      <w:r>
+        <w:pict>
+          <v:rect style="width:0;height:1.5pt" o:hralign="center" o:hrstd="t" o:hr="t"/>
+        </w:pict>
+      </w:r>
+    </w:p>
+    <w:bookmarkEnd w:id="48"/>
+    <w:bookmarkStart w:id="49" w:name="slide-30-passo-3-seja-exemplo-1-min"/>
+    <w:p>
+      <w:pPr>
+        <w:pStyle w:val="Heading2"/>
+      </w:pPr>
+      <w:r>
+        <w:t xml:space="preserve">Slide 30 — Passo 3: seja exemplo · ⏱ 1 min</w:t>
+      </w:r>
+    </w:p>
+    <w:p>
+      <w:pPr>
+        <w:pStyle w:val="FirstParagraph"/>
+      </w:pPr>
+      <w:r>
+        <w:rPr>
+          <w:bCs/>
+          <w:b/>
+        </w:rPr>
+        <w:t xml:space="preserve">Objetivo:</w:t>
+      </w:r>
+      <w:r>
+        <w:t xml:space="preserve"> </w:t>
+      </w:r>
+      <w:r>
+        <w:t xml:space="preserve">reforçar que o exemplo ensina mais que a fala.</w:t>
+      </w:r>
+    </w:p>
+    <w:p>
+      <w:pPr>
+        <w:pStyle w:val="BodyText"/>
+      </w:pPr>
+      <w:r>
+        <w:rPr>
+          <w:bCs/>
+          <w:b/>
+        </w:rPr>
+        <w:t xml:space="preserve">Abordar:</w:t>
+      </w:r>
+      <w:r>
+        <w:t xml:space="preserve"> </w:t>
+      </w:r>
+      <w:r>
+        <w:t xml:space="preserve">- Filhos copiam o que veem</w:t>
+      </w:r>
+      <w:r>
+        <w:t xml:space="preserve"> </w:t>
+      </w:r>
+      <w:r>
+        <w:t xml:space="preserve">- Coerência entre o que falo e o que faço</w:t>
+      </w:r>
+    </w:p>
+    <w:p>
+      <w:pPr>
+        <w:pStyle w:val="BodyText"/>
+      </w:pPr>
+      <w:r>
+        <w:rPr>
+          <w:bCs/>
+          <w:b/>
+        </w:rPr>
+        <w:t xml:space="preserve">Fala sugerida:</w:t>
+      </w:r>
+      <w:r>
+        <w:t xml:space="preserve"> </w:t>
+      </w:r>
+      <w:r>
+        <w:t xml:space="preserve">Passo três: seja exemplo. Já falamos disso hoje e vale repetir: nossos filhos aprendem muito mais com o que fazemos do que com o que dizemos. Se eu peço respeito, preciso tratar com respeito. Se peço que ele leia, ele precisa me ver lendo.</w:t>
+      </w:r>
+    </w:p>
+    <w:p>
+      <w:pPr>
+        <w:pStyle w:val="BodyText"/>
+      </w:pPr>
+      <w:r>
+        <w:rPr>
+          <w:bCs/>
+          <w:b/>
+        </w:rPr>
+        <w:t xml:space="preserve">Transição:</w:t>
+      </w:r>
+      <w:r>
+        <w:t xml:space="preserve"> </w:t>
+      </w:r>
+      <w:r>
+        <w:t xml:space="preserve">E para ser exemplo, é preciso estar junto.</w:t>
+      </w:r>
+    </w:p>
+    <w:p>
+      <w:r>
+        <w:pict>
+          <v:rect style="width:0;height:1.5pt" o:hralign="center" o:hrstd="t" o:hr="t"/>
+        </w:pict>
+      </w:r>
+    </w:p>
+    <w:bookmarkEnd w:id="49"/>
+    <w:bookmarkStart w:id="50" w:name="Xdf16ea27c8cc6fed8f3eeb9a8b2265be935e605"/>
+    <w:p>
+      <w:pPr>
+        <w:pStyle w:val="Heading2"/>
+      </w:pPr>
+      <w:r>
+        <w:t xml:space="preserve">Slide 31 — Passo 4: tempo de qualidade · ⏱ 1 min</w:t>
+      </w:r>
+    </w:p>
+    <w:p>
+      <w:pPr>
+        <w:pStyle w:val="FirstParagraph"/>
+      </w:pPr>
+      <w:r>
+        <w:rPr>
+          <w:bCs/>
+          <w:b/>
+        </w:rPr>
+        <w:t xml:space="preserve">Objetivo:</w:t>
+      </w:r>
+      <w:r>
+        <w:t xml:space="preserve"> </w:t>
+      </w:r>
+      <w:r>
+        <w:t xml:space="preserve">mostrar que qualidade de tempo vale mais que quantidade.</w:t>
+      </w:r>
+    </w:p>
+    <w:p>
+      <w:pPr>
+        <w:pStyle w:val="BodyText"/>
+      </w:pPr>
+      <w:r>
+        <w:rPr>
+          <w:bCs/>
+          <w:b/>
+        </w:rPr>
+        <w:t xml:space="preserve">Abordar:</w:t>
+      </w:r>
+      <w:r>
+        <w:t xml:space="preserve"> </w:t>
+      </w:r>
+      <w:r>
+        <w:t xml:space="preserve">- Atenção total, sem tela</w:t>
+      </w:r>
+      <w:r>
+        <w:t xml:space="preserve"> </w:t>
+      </w:r>
+      <w:r>
+        <w:t xml:space="preserve">- Pequenos rituais: jantar, conversa antes de dormir</w:t>
+      </w:r>
+    </w:p>
+    <w:p>
+      <w:pPr>
+        <w:pStyle w:val="BodyText"/>
+      </w:pPr>
+      <w:r>
+        <w:rPr>
+          <w:bCs/>
+          <w:b/>
+        </w:rPr>
+        <w:t xml:space="preserve">Fala sugerida:</w:t>
+      </w:r>
+      <w:r>
+        <w:t xml:space="preserve"> </w:t>
+      </w:r>
+      <w:r>
+        <w:t xml:space="preserve">Passo quatro: invista em tempo de qualidade. Não precisa ser muito tempo. Precisa ser tempo inteiro: sem celular, olhando no olho. Um jantar conversando, um jogo de dez minutos, a historinha antes de dormir. São esses momentos que a criança vai guardar.</w:t>
+      </w:r>
+    </w:p>
+    <w:p>
+      <w:pPr>
+        <w:pStyle w:val="BodyText"/>
+      </w:pPr>
+      <w:r>
+        <w:rPr>
+          <w:bCs/>
+          <w:b/>
+        </w:rPr>
+        <w:t xml:space="preserve">Transição:</w:t>
+      </w:r>
+      <w:r>
+        <w:t xml:space="preserve"> </w:t>
+      </w:r>
+      <w:r>
+        <w:t xml:space="preserve">E nesse tempo junto, o jeito de falar faz toda a diferença.</w:t>
+      </w:r>
+    </w:p>
+    <w:p>
+      <w:r>
+        <w:pict>
+          <v:rect style="width:0;height:1.5pt" o:hralign="center" o:hrstd="t" o:hr="t"/>
+        </w:pict>
+      </w:r>
+    </w:p>
+    <w:bookmarkEnd w:id="50"/>
+    <w:bookmarkStart w:id="51" w:name="X2e206f5431b1cc10910bcad67b2869afe343aa4"/>
+    <w:p>
+      <w:pPr>
+        <w:pStyle w:val="Heading2"/>
+      </w:pPr>
+      <w:r>
+        <w:t xml:space="preserve">Slide 32 — Passo 5: comunicação com clareza e amor · ⏱ 1 min</w:t>
+      </w:r>
+    </w:p>
+    <w:p>
+      <w:pPr>
+        <w:pStyle w:val="FirstParagraph"/>
+      </w:pPr>
+      <w:r>
+        <w:rPr>
+          <w:bCs/>
+          <w:b/>
+        </w:rPr>
+        <w:t xml:space="preserve">Objetivo:</w:t>
+      </w:r>
+      <w:r>
+        <w:t xml:space="preserve"> </w:t>
+      </w:r>
+      <w:r>
+        <w:t xml:space="preserve">mostrar como a comunicação constrói a relação.</w:t>
+      </w:r>
+    </w:p>
+    <w:p>
+      <w:pPr>
+        <w:pStyle w:val="BodyText"/>
+      </w:pPr>
+      <w:r>
+        <w:rPr>
+          <w:bCs/>
+          <w:b/>
+        </w:rPr>
+        <w:t xml:space="preserve">Abordar:</w:t>
+      </w:r>
+      <w:r>
+        <w:t xml:space="preserve"> </w:t>
+      </w:r>
+      <w:r>
+        <w:t xml:space="preserve">- Clareza: a criança precisa entender o que se espera dela</w:t>
+      </w:r>
+      <w:r>
+        <w:t xml:space="preserve"> </w:t>
+      </w:r>
+      <w:r>
+        <w:t xml:space="preserve">- Amor: firmeza sem humilhação</w:t>
+      </w:r>
+    </w:p>
+    <w:p>
+      <w:pPr>
+        <w:pStyle w:val="BodyText"/>
+      </w:pPr>
+      <w:r>
+        <w:rPr>
+          <w:bCs/>
+          <w:b/>
+        </w:rPr>
+        <w:t xml:space="preserve">Fala sugerida:</w:t>
+      </w:r>
+      <w:r>
+        <w:t xml:space="preserve"> </w:t>
+      </w:r>
+      <w:r>
+        <w:t xml:space="preserve">Passo cinco: comunique-se com clareza e amor. Clareza, porque a criança precisa entender exatamente o que esperamos dela.</w:t>
+      </w:r>
+      <w:r>
+        <w:t xml:space="preserve"> </w:t>
+      </w:r>
+      <w:r>
+        <w:t xml:space="preserve">“</w:t>
+      </w:r>
+      <w:r>
+        <w:t xml:space="preserve">Arruma o quarto</w:t>
+      </w:r>
+      <w:r>
+        <w:t xml:space="preserve">”</w:t>
+      </w:r>
+      <w:r>
+        <w:t xml:space="preserve"> </w:t>
+      </w:r>
+      <w:r>
+        <w:t xml:space="preserve">é vago;</w:t>
+      </w:r>
+      <w:r>
+        <w:t xml:space="preserve"> </w:t>
+      </w:r>
+      <w:r>
+        <w:t xml:space="preserve">“</w:t>
+      </w:r>
+      <w:r>
+        <w:t xml:space="preserve">guarda os brinquedos na caixa antes do jantar</w:t>
+      </w:r>
+      <w:r>
+        <w:t xml:space="preserve">”</w:t>
+      </w:r>
+      <w:r>
+        <w:t xml:space="preserve"> </w:t>
+      </w:r>
+      <w:r>
+        <w:t xml:space="preserve">é claro. E amor, porque dá para ser firme sem gritar e sem humilhar.</w:t>
+      </w:r>
+    </w:p>
+    <w:p>
+      <w:pPr>
+        <w:pStyle w:val="BodyText"/>
+      </w:pPr>
+      <w:r>
+        <w:rPr>
+          <w:bCs/>
+          <w:b/>
+        </w:rPr>
+        <w:t xml:space="preserve">Transição:</w:t>
+      </w:r>
+      <w:r>
+        <w:t xml:space="preserve"> </w:t>
+      </w:r>
+      <w:r>
+        <w:t xml:space="preserve">E comunicar com clareza ajuda muito no próximo passo.</w:t>
+      </w:r>
+    </w:p>
+    <w:p>
+      <w:r>
+        <w:pict>
+          <v:rect style="width:0;height:1.5pt" o:hralign="center" o:hrstd="t" o:hr="t"/>
+        </w:pict>
+      </w:r>
+    </w:p>
+    <w:bookmarkEnd w:id="51"/>
+    <w:bookmarkStart w:id="52" w:name="X5be38af11c40d754c9af7818bb92263f31d558b"/>
+    <w:p>
+      <w:pPr>
+        <w:pStyle w:val="Heading2"/>
+      </w:pPr>
+      <w:r>
+        <w:t xml:space="preserve">Slide 33 — Passo 6: regras e limites consistentes · ⏱ 1 min</w:t>
+      </w:r>
+    </w:p>
+    <w:p>
+      <w:pPr>
+        <w:pStyle w:val="FirstParagraph"/>
+      </w:pPr>
+      <w:r>
+        <w:rPr>
+          <w:bCs/>
+          <w:b/>
+        </w:rPr>
+        <w:t xml:space="preserve">Objetivo:</w:t>
+      </w:r>
+      <w:r>
+        <w:t xml:space="preserve"> </w:t>
+      </w:r>
+      <w:r>
+        <w:t xml:space="preserve">ligar os limites, já vistos, à consistência.</w:t>
+      </w:r>
+    </w:p>
+    <w:p>
+      <w:pPr>
+        <w:pStyle w:val="BodyText"/>
+      </w:pPr>
+      <w:r>
+        <w:rPr>
+          <w:bCs/>
+          <w:b/>
+        </w:rPr>
+        <w:t xml:space="preserve">Abordar:</w:t>
+      </w:r>
+      <w:r>
+        <w:t xml:space="preserve"> </w:t>
+      </w:r>
+      <w:r>
+        <w:t xml:space="preserve">- Limite que muda todo dia não ensina</w:t>
+      </w:r>
+      <w:r>
+        <w:t xml:space="preserve"> </w:t>
+      </w:r>
+      <w:r>
+        <w:t xml:space="preserve">- Pai e mãe falando a mesma língua</w:t>
+      </w:r>
+    </w:p>
+    <w:p>
+      <w:pPr>
+        <w:pStyle w:val="BodyText"/>
+      </w:pPr>
+      <w:r>
+        <w:rPr>
+          <w:bCs/>
+          <w:b/>
+        </w:rPr>
+        <w:t xml:space="preserve">Fala sugerida:</w:t>
+      </w:r>
+      <w:r>
+        <w:t xml:space="preserve"> </w:t>
+      </w:r>
+      <w:r>
+        <w:t xml:space="preserve">Passo seis: defina regras e limites consistentes. Lembram que limite é cuidado? Ele só funciona se for consistente. Se hoje pode e amanhã não pode, a criança aprende a testar. E é muito importante que os adultos da casa combinem entre si e falem a mesma língua.</w:t>
+      </w:r>
+    </w:p>
+    <w:p>
+      <w:pPr>
+        <w:pStyle w:val="BodyText"/>
+      </w:pPr>
+      <w:r>
+        <w:rPr>
+          <w:bCs/>
+          <w:b/>
+        </w:rPr>
+        <w:t xml:space="preserve">Transição:</w:t>
+      </w:r>
+      <w:r>
+        <w:t xml:space="preserve"> </w:t>
+      </w:r>
+      <w:r>
+        <w:t xml:space="preserve">Além dos limites, há valores que precisamos ensinar de propósito.</w:t>
+      </w:r>
+    </w:p>
+    <w:p>
+      <w:r>
+        <w:pict>
+          <v:rect style="width:0;height:1.5pt" o:hralign="center" o:hrstd="t" o:hr="t"/>
+        </w:pict>
+      </w:r>
+    </w:p>
+    <w:bookmarkEnd w:id="52"/>
+    <w:bookmarkStart w:id="53" w:name="Xe2af987c47dee70dea381603aef36d61578a41c"/>
+    <w:p>
+      <w:pPr>
+        <w:pStyle w:val="Heading2"/>
+      </w:pPr>
+      <w:r>
+        <w:t xml:space="preserve">Slide 34 — Passo 7: gratidão e autorresponsabilidade · ⏱ 1 min</w:t>
+      </w:r>
+    </w:p>
+    <w:p>
+      <w:pPr>
+        <w:pStyle w:val="FirstParagraph"/>
+      </w:pPr>
+      <w:r>
+        <w:rPr>
+          <w:bCs/>
+          <w:b/>
+        </w:rPr>
+        <w:t xml:space="preserve">Objetivo:</w:t>
+      </w:r>
+      <w:r>
+        <w:t xml:space="preserve"> </w:t>
+      </w:r>
+      <w:r>
+        <w:t xml:space="preserve">apresentar dois valores que formam o caráter.</w:t>
+      </w:r>
+    </w:p>
+    <w:p>
+      <w:pPr>
+        <w:pStyle w:val="BodyText"/>
+      </w:pPr>
+      <w:r>
+        <w:rPr>
+          <w:bCs/>
+          <w:b/>
+        </w:rPr>
+        <w:t xml:space="preserve">Abordar:</w:t>
+      </w:r>
+      <w:r>
+        <w:t xml:space="preserve"> </w:t>
+      </w:r>
+      <w:r>
+        <w:t xml:space="preserve">- Gratidão: valorizar o que se tem</w:t>
+      </w:r>
+      <w:r>
+        <w:t xml:space="preserve"> </w:t>
+      </w:r>
+      <w:r>
+        <w:t xml:space="preserve">- Autorresponsabilidade: assumir as próprias escolhas</w:t>
+      </w:r>
+    </w:p>
+    <w:p>
+      <w:pPr>
+        <w:pStyle w:val="BodyText"/>
+      </w:pPr>
+      <w:r>
+        <w:rPr>
+          <w:bCs/>
+          <w:b/>
+        </w:rPr>
+        <w:t xml:space="preserve">Fala sugerida:</w:t>
+      </w:r>
+      <w:r>
+        <w:t xml:space="preserve"> </w:t>
+      </w:r>
+      <w:r>
+        <w:t xml:space="preserve">Passo sete: ensine gratidão e autorresponsabilidade. Gratidão é aprender a valorizar o que tem e quem está por perto. Autorresponsabilidade é entender que as minhas escolhas têm consequências, sem culpar sempre o outro. Os dois se ensinam no dia a dia: agradecer à mesa, ajudar a resolver em vez de resolver por ele.</w:t>
+      </w:r>
+    </w:p>
+    <w:p>
+      <w:pPr>
+        <w:pStyle w:val="BodyText"/>
+      </w:pPr>
+      <w:r>
+        <w:rPr>
+          <w:bCs/>
+          <w:b/>
+        </w:rPr>
+        <w:t xml:space="preserve">Transição:</w:t>
+      </w:r>
+      <w:r>
+        <w:t xml:space="preserve"> </w:t>
+      </w:r>
+      <w:r>
+        <w:t xml:space="preserve">E para assumir responsabilidades, a criança precisa acreditar em si.</w:t>
+      </w:r>
+    </w:p>
+    <w:p>
+      <w:r>
+        <w:pict>
+          <v:rect style="width:0;height:1.5pt" o:hralign="center" o:hrstd="t" o:hr="t"/>
+        </w:pict>
+      </w:r>
+    </w:p>
+    <w:bookmarkEnd w:id="53"/>
+    <w:bookmarkStart w:id="54" w:name="X52dbcec65861e375d16c88a504581c13d7fa169"/>
+    <w:p>
+      <w:pPr>
+        <w:pStyle w:val="Heading2"/>
+      </w:pPr>
+      <w:r>
+        <w:t xml:space="preserve">Slide 35 — Passo 8: autoestima e identidade · ⏱ 1 min</w:t>
+      </w:r>
+    </w:p>
+    <w:p>
+      <w:pPr>
+        <w:pStyle w:val="FirstParagraph"/>
+      </w:pPr>
+      <w:r>
+        <w:rPr>
+          <w:bCs/>
+          <w:b/>
+        </w:rPr>
+        <w:t xml:space="preserve">Objetivo:</w:t>
+      </w:r>
+      <w:r>
+        <w:t xml:space="preserve"> </w:t>
+      </w:r>
+      <w:r>
+        <w:t xml:space="preserve">mostrar o papel dos pais na autoestima do filho.</w:t>
+      </w:r>
+    </w:p>
+    <w:p>
+      <w:pPr>
+        <w:pStyle w:val="BodyText"/>
+      </w:pPr>
+      <w:r>
+        <w:rPr>
+          <w:bCs/>
+          <w:b/>
+        </w:rPr>
+        <w:t xml:space="preserve">Abordar:</w:t>
+      </w:r>
+      <w:r>
+        <w:t xml:space="preserve"> </w:t>
+      </w:r>
+      <w:r>
+        <w:t xml:space="preserve">- Elogiar o esforço, não só o resultado</w:t>
+      </w:r>
+      <w:r>
+        <w:t xml:space="preserve"> </w:t>
+      </w:r>
+      <w:r>
+        <w:t xml:space="preserve">- Ajudar o filho a saber quem ele é</w:t>
+      </w:r>
+    </w:p>
+    <w:p>
+      <w:pPr>
+        <w:pStyle w:val="BodyText"/>
+      </w:pPr>
+      <w:r>
+        <w:rPr>
+          <w:bCs/>
+          <w:b/>
+        </w:rPr>
+        <w:t xml:space="preserve">Fala sugerida:</w:t>
+      </w:r>
+      <w:r>
+        <w:t xml:space="preserve"> </w:t>
+      </w:r>
+      <w:r>
+        <w:t xml:space="preserve">Passo oito: reforce a autoestima e a identidade. A criança se enxerga, em grande parte, pelos olhos dos pais. Elogie o esforço, não só a nota. Mostre que ela é amada pelo que é, e não pelo que faz. Uma criança que sabe quem é fica menos vulnerável à opinião dos outros.</w:t>
+      </w:r>
+    </w:p>
+    <w:p>
+      <w:pPr>
+        <w:pStyle w:val="BodyText"/>
+      </w:pPr>
+      <w:r>
+        <w:rPr>
+          <w:bCs/>
+          <w:b/>
+        </w:rPr>
+        <w:t xml:space="preserve">Transição:</w:t>
+      </w:r>
+      <w:r>
+        <w:t xml:space="preserve"> </w:t>
+      </w:r>
+      <w:r>
+        <w:t xml:space="preserve">E nada reforça mais a autoestima do que se sentir amado.</w:t>
+      </w:r>
+    </w:p>
+    <w:p>
+      <w:r>
+        <w:pict>
+          <v:rect style="width:0;height:1.5pt" o:hralign="center" o:hrstd="t" o:hr="t"/>
+        </w:pict>
+      </w:r>
+    </w:p>
+    <w:bookmarkEnd w:id="54"/>
+    <w:bookmarkStart w:id="55" w:name="X31bab43c42949c7c0a2aa8e1439bc3d6772a10d"/>
+    <w:p>
+      <w:pPr>
+        <w:pStyle w:val="Heading2"/>
+      </w:pPr>
+      <w:r>
+        <w:t xml:space="preserve">Slide 36 — Passo 9: amor todos os dias · ⏱ 1 min</w:t>
+      </w:r>
+    </w:p>
+    <w:p>
+      <w:pPr>
+        <w:pStyle w:val="FirstParagraph"/>
+      </w:pPr>
+      <w:r>
+        <w:rPr>
+          <w:bCs/>
+          <w:b/>
+        </w:rPr>
+        <w:t xml:space="preserve">Objetivo:</w:t>
+      </w:r>
+      <w:r>
+        <w:t xml:space="preserve"> </w:t>
+      </w:r>
+      <w:r>
+        <w:t xml:space="preserve">lembrar que o amor precisa ser demonstrado.</w:t>
+      </w:r>
+    </w:p>
+    <w:p>
+      <w:pPr>
+        <w:pStyle w:val="BodyText"/>
+      </w:pPr>
+      <w:r>
+        <w:rPr>
+          <w:bCs/>
+          <w:b/>
+        </w:rPr>
+        <w:t xml:space="preserve">Abordar:</w:t>
+      </w:r>
+      <w:r>
+        <w:t xml:space="preserve"> </w:t>
+      </w:r>
+      <w:r>
+        <w:t xml:space="preserve">- Amar e demonstrar são coisas diferentes</w:t>
+      </w:r>
+      <w:r>
+        <w:t xml:space="preserve"> </w:t>
+      </w:r>
+      <w:r>
+        <w:t xml:space="preserve">- Gestos simples: abraço, bilhete,</w:t>
+      </w:r>
+      <w:r>
+        <w:t xml:space="preserve"> </w:t>
+      </w:r>
+      <w:r>
+        <w:t xml:space="preserve">“</w:t>
+      </w:r>
+      <w:r>
+        <w:t xml:space="preserve">eu te amo</w:t>
+      </w:r>
+      <w:r>
+        <w:t xml:space="preserve">”</w:t>
+      </w:r>
+    </w:p>
+    <w:p>
+      <w:pPr>
+        <w:pStyle w:val="BodyText"/>
+      </w:pPr>
+      <w:r>
+        <w:rPr>
+          <w:bCs/>
+          <w:b/>
+        </w:rPr>
+        <w:t xml:space="preserve">Fala sugerida:</w:t>
+      </w:r>
+      <w:r>
+        <w:t xml:space="preserve"> </w:t>
+      </w:r>
+      <w:r>
+        <w:t xml:space="preserve">Passo nove: demonstre amor diariamente. Todos aqui amam seus filhos, mas será que eles sentem isso todos os dias? Um abraço na saída, um bilhete na lancheira, um</w:t>
+      </w:r>
+      <w:r>
+        <w:t xml:space="preserve"> </w:t>
+      </w:r>
+      <w:r>
+        <w:t xml:space="preserve">“</w:t>
+      </w:r>
+      <w:r>
+        <w:t xml:space="preserve">eu tenho orgulho de você</w:t>
+      </w:r>
+      <w:r>
+        <w:t xml:space="preserve">”</w:t>
+      </w:r>
+      <w:r>
+        <w:t xml:space="preserve">. Amor que não se demonstra a criança não enxerga.</w:t>
+      </w:r>
+    </w:p>
+    <w:p>
+      <w:pPr>
+        <w:pStyle w:val="BodyText"/>
+      </w:pPr>
+      <w:r>
+        <w:rPr>
+          <w:bCs/>
+          <w:b/>
+        </w:rPr>
+        <w:t xml:space="preserve">Transição:</w:t>
+      </w:r>
+      <w:r>
+        <w:t xml:space="preserve"> </w:t>
+      </w:r>
+      <w:r>
+        <w:t xml:space="preserve">E com esse amor como base, ela consegue enfrentar as dificuldades.</w:t>
+      </w:r>
+    </w:p>
+    <w:p>
+      <w:r>
+        <w:pict>
+          <v:rect style="width:0;height:1.5pt" o:hralign="center" o:hrstd="t" o:hr="t"/>
+        </w:pict>
+      </w:r>
+    </w:p>
+    <w:bookmarkEnd w:id="55"/>
+    <w:bookmarkStart w:id="56" w:name="Xcd472ac04196ef3d9987ee852ae92fa327d95c0"/>
+    <w:p>
+      <w:pPr>
+        <w:pStyle w:val="Heading2"/>
+      </w:pPr>
+      <w:r>
+        <w:t xml:space="preserve">Slide 37 — Passo 10: resiliência e mentalidade de crescimento · ⏱ 1 min</w:t>
+      </w:r>
+    </w:p>
+    <w:p>
+      <w:pPr>
+        <w:pStyle w:val="FirstParagraph"/>
+      </w:pPr>
+      <w:r>
+        <w:rPr>
+          <w:bCs/>
+          <w:b/>
+        </w:rPr>
+        <w:t xml:space="preserve">Objetivo:</w:t>
+      </w:r>
+      <w:r>
+        <w:t xml:space="preserve"> </w:t>
+      </w:r>
+      <w:r>
+        <w:t xml:space="preserve">mostrar como preparar o filho para lidar com frustrações.</w:t>
+      </w:r>
+    </w:p>
+    <w:p>
+      <w:pPr>
+        <w:pStyle w:val="BodyText"/>
+      </w:pPr>
+      <w:r>
+        <w:rPr>
+          <w:bCs/>
+          <w:b/>
+        </w:rPr>
+        <w:t xml:space="preserve">Abordar:</w:t>
+      </w:r>
+      <w:r>
+        <w:t xml:space="preserve"> </w:t>
+      </w:r>
+      <w:r>
+        <w:t xml:space="preserve">- Errar faz parte de aprender</w:t>
+      </w:r>
+      <w:r>
+        <w:t xml:space="preserve"> </w:t>
+      </w:r>
+      <w:r>
+        <w:t xml:space="preserve">- Não resolver tudo pela criança</w:t>
+      </w:r>
+    </w:p>
+    <w:p>
+      <w:pPr>
+        <w:pStyle w:val="BodyText"/>
+      </w:pPr>
+      <w:r>
+        <w:rPr>
+          <w:bCs/>
+          <w:b/>
+        </w:rPr>
+        <w:t xml:space="preserve">Fala sugerida:</w:t>
+      </w:r>
+      <w:r>
+        <w:t xml:space="preserve"> </w:t>
+      </w:r>
+      <w:r>
+        <w:t xml:space="preserve">Passo dez: desenvolva resiliência e mentalidade de crescimento. Isso significa ensinar que errar faz parte, que dá para tentar de novo e melhorar. Quando a gente resolve tudo pelo filho, ele não aprende a lidar com a frustração. Troque</w:t>
+      </w:r>
+      <w:r>
+        <w:t xml:space="preserve"> </w:t>
+      </w:r>
+      <w:r>
+        <w:t xml:space="preserve">“</w:t>
+      </w:r>
+      <w:r>
+        <w:t xml:space="preserve">você não consegue</w:t>
+      </w:r>
+      <w:r>
+        <w:t xml:space="preserve">”</w:t>
+      </w:r>
+      <w:r>
+        <w:t xml:space="preserve"> </w:t>
+      </w:r>
+      <w:r>
+        <w:t xml:space="preserve">por</w:t>
+      </w:r>
+      <w:r>
+        <w:t xml:space="preserve"> </w:t>
+      </w:r>
+      <w:r>
+        <w:t xml:space="preserve">“</w:t>
+      </w:r>
+      <w:r>
+        <w:t xml:space="preserve">você ainda não consegue</w:t>
+      </w:r>
+      <w:r>
+        <w:t xml:space="preserve">”</w:t>
+      </w:r>
+      <w:r>
+        <w:t xml:space="preserve">.</w:t>
+      </w:r>
+    </w:p>
+    <w:p>
+      <w:pPr>
+        <w:pStyle w:val="BodyText"/>
+      </w:pPr>
+      <w:r>
+        <w:rPr>
+          <w:bCs/>
+          <w:b/>
+        </w:rPr>
+        <w:t xml:space="preserve">Transição:</w:t>
+      </w:r>
+      <w:r>
+        <w:t xml:space="preserve"> </w:t>
+      </w:r>
+      <w:r>
+        <w:t xml:space="preserve">E quem aprende a persistir pode sonhar mais alto.</w:t>
+      </w:r>
+    </w:p>
+    <w:p>
+      <w:r>
+        <w:pict>
+          <v:rect style="width:0;height:1.5pt" o:hralign="center" o:hrstd="t" o:hr="t"/>
+        </w:pict>
+      </w:r>
+    </w:p>
+    <w:bookmarkEnd w:id="56"/>
+    <w:bookmarkStart w:id="57" w:name="slide-38-passo-11-sonhos-e-metas-1-min"/>
+    <w:p>
+      <w:pPr>
+        <w:pStyle w:val="Heading2"/>
+      </w:pPr>
+      <w:r>
+        <w:t xml:space="preserve">Slide 38 — Passo 11: sonhos e metas · ⏱ 1 min</w:t>
+      </w:r>
+    </w:p>
+    <w:p>
+      <w:pPr>
+        <w:pStyle w:val="FirstParagraph"/>
+      </w:pPr>
+      <w:r>
+        <w:rPr>
+          <w:bCs/>
+          <w:b/>
+        </w:rPr>
+        <w:t xml:space="preserve">Objetivo:</w:t>
+      </w:r>
+      <w:r>
+        <w:t xml:space="preserve"> </w:t>
+      </w:r>
+      <w:r>
+        <w:t xml:space="preserve">incentivar os pais a apoiar os sonhos dos filhos.</w:t>
+      </w:r>
+    </w:p>
+    <w:p>
+      <w:pPr>
+        <w:pStyle w:val="BodyText"/>
+      </w:pPr>
+      <w:r>
+        <w:rPr>
+          <w:bCs/>
+          <w:b/>
+        </w:rPr>
+        <w:t xml:space="preserve">Abordar:</w:t>
+      </w:r>
+      <w:r>
+        <w:t xml:space="preserve"> </w:t>
+      </w:r>
+      <w:r>
+        <w:t xml:space="preserve">- Perguntar: qual é o seu sonho?</w:t>
+      </w:r>
+      <w:r>
+        <w:t xml:space="preserve"> </w:t>
+      </w:r>
+      <w:r>
+        <w:t xml:space="preserve">- Transformar sonho em pequenas metas</w:t>
+      </w:r>
+    </w:p>
+    <w:p>
+      <w:pPr>
+        <w:pStyle w:val="BodyText"/>
+      </w:pPr>
+      <w:r>
+        <w:rPr>
+          <w:bCs/>
+          <w:b/>
+        </w:rPr>
+        <w:t xml:space="preserve">Fala sugerida:</w:t>
+      </w:r>
+      <w:r>
+        <w:t xml:space="preserve"> </w:t>
+      </w:r>
+      <w:r>
+        <w:t xml:space="preserve">Passo onze: incentive sonhos e metas. Pergunte ao seu filho o que ele sonha. Leve a sério, mesmo que hoje pareça pequeno ou mude toda semana. E ajude a transformar o sonho em pequenas metas: o que dá para fazer esta semana para chegar mais perto?</w:t>
+      </w:r>
+    </w:p>
+    <w:p>
+      <w:pPr>
+        <w:pStyle w:val="BodyText"/>
+      </w:pPr>
+      <w:r>
+        <w:rPr>
+          <w:bCs/>
+          <w:b/>
+        </w:rPr>
+        <w:t xml:space="preserve">Transição:</w:t>
+      </w:r>
+      <w:r>
+        <w:t xml:space="preserve"> </w:t>
+      </w:r>
+      <w:r>
+        <w:t xml:space="preserve">E, por fim, o passo que dá sentido a todos os outros.</w:t>
+      </w:r>
+    </w:p>
+    <w:p>
+      <w:r>
+        <w:pict>
+          <v:rect style="width:0;height:1.5pt" o:hralign="center" o:hrstd="t" o:hr="t"/>
+        </w:pict>
+      </w:r>
+    </w:p>
+    <w:bookmarkEnd w:id="57"/>
+    <w:bookmarkStart w:id="58" w:name="X81f7ee4005c007c6c56b55e6f49480a19b4ee3e"/>
+    <w:p>
+      <w:pPr>
+        <w:pStyle w:val="Heading2"/>
+      </w:pPr>
+      <w:r>
+        <w:t xml:space="preserve">Slide 39 — Passo 12: propósito e espiritualidade · ⏱ 1 min 30 s</w:t>
+      </w:r>
+    </w:p>
+    <w:p>
+      <w:pPr>
+        <w:pStyle w:val="FirstParagraph"/>
+      </w:pPr>
+      <w:r>
+        <w:rPr>
+          <w:bCs/>
+          <w:b/>
+        </w:rPr>
+        <w:t xml:space="preserve">Objetivo:</w:t>
+      </w:r>
+      <w:r>
+        <w:t xml:space="preserve"> </w:t>
+      </w:r>
+      <w:r>
+        <w:t xml:space="preserve">fechar os passos com o sentido maior da educação.</w:t>
+      </w:r>
+    </w:p>
+    <w:p>
+      <w:pPr>
+        <w:pStyle w:val="BodyText"/>
+      </w:pPr>
+      <w:r>
+        <w:rPr>
+          <w:bCs/>
+          <w:b/>
+        </w:rPr>
+        <w:t xml:space="preserve">Abordar:</w:t>
+      </w:r>
+      <w:r>
+        <w:t xml:space="preserve"> </w:t>
+      </w:r>
+      <w:r>
+        <w:t xml:space="preserve">- Liderar a família com propósito</w:t>
+      </w:r>
+      <w:r>
+        <w:t xml:space="preserve"> </w:t>
+      </w:r>
+      <w:r>
+        <w:t xml:space="preserve">- Espiritualidade como base de valores e sentido</w:t>
+      </w:r>
+    </w:p>
+    <w:p>
+      <w:pPr>
+        <w:pStyle w:val="BodyText"/>
+      </w:pPr>
+      <w:r>
+        <w:rPr>
+          <w:bCs/>
+          <w:b/>
+        </w:rPr>
+        <w:t xml:space="preserve">Fala sugerida:</w:t>
+      </w:r>
+      <w:r>
+        <w:t xml:space="preserve"> </w:t>
+      </w:r>
+      <w:r>
+        <w:t xml:space="preserve">Passo doze: lidere com propósito e espiritualidade. Liderar a família é saber para onde estamos indo e por quê. E a espiritualidade, do jeito que cada família vive, dá sentido aos valores, ensina esperança e ajuda a criança a entender que faz parte de algo maior. Esse é o alicerce de toda a casa que falamos lá no começo.</w:t>
+      </w:r>
+    </w:p>
+    <w:p>
+      <w:pPr>
+        <w:pStyle w:val="BodyText"/>
+      </w:pPr>
+      <w:r>
+        <w:rPr>
+          <w:bCs/>
+          <w:b/>
+        </w:rPr>
+        <w:t xml:space="preserve">Transição:</w:t>
+      </w:r>
+      <w:r>
+        <w:t xml:space="preserve"> </w:t>
+      </w:r>
+      <w:r>
+        <w:t xml:space="preserve">E agora, uma imagem para encerrar.</w:t>
+      </w:r>
+    </w:p>
+    <w:p>
+      <w:r>
+        <w:pict>
+          <v:rect style="width:0;height:1.5pt" o:hralign="center" o:hrstd="t" o:hr="t"/>
+        </w:pict>
+      </w:r>
+    </w:p>
+    <w:bookmarkEnd w:id="58"/>
+    <w:bookmarkStart w:id="59" w:name="slide-40-a-gaiola-1-min-30-s"/>
+    <w:p>
+      <w:pPr>
+        <w:pStyle w:val="Heading2"/>
+      </w:pPr>
+      <w:r>
+        <w:t xml:space="preserve">Slide 40 — A gaiola · ⏱ 1 min 30 s</w:t>
+      </w:r>
+    </w:p>
+    <w:p>
+      <w:pPr>
+        <w:pStyle w:val="FirstParagraph"/>
+      </w:pPr>
+      <w:r>
+        <w:rPr>
+          <w:bCs/>
+          <w:b/>
+        </w:rPr>
+        <w:t xml:space="preserve">Objetivo:</w:t>
+      </w:r>
+      <w:r>
+        <w:t xml:space="preserve"> </w:t>
+      </w:r>
+      <w:r>
+        <w:t xml:space="preserve">retomar</w:t>
+      </w:r>
+      <w:r>
+        <w:t xml:space="preserve"> </w:t>
+      </w:r>
+      <w:r>
+        <w:t xml:space="preserve">“</w:t>
+      </w:r>
+      <w:r>
+        <w:t xml:space="preserve">proprietário ou embaixador</w:t>
+      </w:r>
+      <w:r>
+        <w:t xml:space="preserve">”</w:t>
+      </w:r>
+      <w:r>
+        <w:t xml:space="preserve"> </w:t>
+      </w:r>
+      <w:r>
+        <w:t xml:space="preserve">e fechar a reflexão.</w:t>
+      </w:r>
+    </w:p>
+    <w:p>
+      <w:pPr>
+        <w:pStyle w:val="BodyText"/>
+      </w:pPr>
+      <w:r>
+        <w:rPr>
+          <w:bCs/>
+          <w:b/>
+        </w:rPr>
+        <w:t xml:space="preserve">Abordar:</w:t>
+      </w:r>
+      <w:r>
+        <w:t xml:space="preserve"> </w:t>
+      </w:r>
+      <w:r>
+        <w:t xml:space="preserve">- A gaiola está vazia e aberta</w:t>
+      </w:r>
+      <w:r>
+        <w:t xml:space="preserve"> </w:t>
+      </w:r>
+      <w:r>
+        <w:t xml:space="preserve">- Educar é preparar para voar, não prender</w:t>
+      </w:r>
+    </w:p>
+    <w:p>
+      <w:pPr>
+        <w:pStyle w:val="BodyText"/>
+      </w:pPr>
+      <w:r>
+        <w:rPr>
+          <w:bCs/>
+          <w:b/>
+        </w:rPr>
+        <w:t xml:space="preserve">Fala sugerida:</w:t>
+      </w:r>
+      <w:r>
+        <w:t xml:space="preserve"> </w:t>
+      </w:r>
+      <w:r>
+        <w:t xml:space="preserve">Olhem essa gaiola. Ela está vazia. Lembram da pergunta</w:t>
+      </w:r>
+      <w:r>
+        <w:t xml:space="preserve"> </w:t>
+      </w:r>
+      <w:r>
+        <w:t xml:space="preserve">“</w:t>
+      </w:r>
+      <w:r>
+        <w:t xml:space="preserve">proprietário ou embaixador</w:t>
+      </w:r>
+      <w:r>
+        <w:t xml:space="preserve">”</w:t>
+      </w:r>
+      <w:r>
+        <w:t xml:space="preserve">? O proprietário quer prender. O embaixador prepara para o voo. Todos esses passos que vimos hoje servem para isso: um dia nossos filhos vão sair de casa, e o que vai com eles é o que construímos aqui, tijolo por tijolo.</w:t>
+      </w:r>
+    </w:p>
+    <w:p>
+      <w:pPr>
+        <w:pStyle w:val="BodyText"/>
+      </w:pPr>
+      <w:r>
+        <w:rPr>
+          <w:bCs/>
+          <w:b/>
+        </w:rPr>
+        <w:t xml:space="preserve">Transição:</w:t>
+      </w:r>
+      <w:r>
+        <w:t xml:space="preserve"> </w:t>
+      </w:r>
+      <w:r>
+        <w:t xml:space="preserve">E para encerrar, uma frase para guardar.</w:t>
+      </w:r>
+    </w:p>
+    <w:p>
+      <w:r>
+        <w:pict>
+          <v:rect style="width:0;height:1.5pt" o:hralign="center" o:hrstd="t" o:hr="t"/>
+        </w:pict>
+      </w:r>
+    </w:p>
+    <w:bookmarkEnd w:id="59"/>
+    <w:bookmarkStart w:id="60" w:name="slide-41-educar-com-intenção-1-min"/>
+    <w:p>
+      <w:pPr>
+        <w:pStyle w:val="Heading2"/>
+      </w:pPr>
+      <w:r>
+        <w:t xml:space="preserve">Slide 41 — Educar com intenção · ⏱ 1 min</w:t>
+      </w:r>
+    </w:p>
+    <w:p>
+      <w:pPr>
+        <w:pStyle w:val="FirstParagraph"/>
+      </w:pPr>
+      <w:r>
+        <w:rPr>
+          <w:bCs/>
+          <w:b/>
+        </w:rPr>
+        <w:t xml:space="preserve">Objetivo:</w:t>
+      </w:r>
+      <w:r>
+        <w:t xml:space="preserve"> </w:t>
+      </w:r>
+      <w:r>
+        <w:t xml:space="preserve">fechar com a mensagem principal e um compromisso prático.</w:t>
+      </w:r>
+    </w:p>
+    <w:p>
+      <w:pPr>
+        <w:pStyle w:val="BodyText"/>
+      </w:pPr>
+      <w:r>
+        <w:rPr>
+          <w:bCs/>
+          <w:b/>
+        </w:rPr>
+        <w:t xml:space="preserve">Abordar:</w:t>
+      </w:r>
+      <w:r>
+        <w:t xml:space="preserve"> </w:t>
+      </w:r>
+      <w:r>
+        <w:t xml:space="preserve">- Retomar: presença, filtro, limite</w:t>
+      </w:r>
+      <w:r>
+        <w:t xml:space="preserve"> </w:t>
+      </w:r>
+      <w:r>
+        <w:t xml:space="preserve">- Compromisso da semana: um momento intencional por dia</w:t>
+      </w:r>
+    </w:p>
+    <w:p>
+      <w:pPr>
+        <w:pStyle w:val="BodyText"/>
+      </w:pPr>
+      <w:r>
+        <w:rPr>
+          <w:bCs/>
+          <w:b/>
+        </w:rPr>
+        <w:t xml:space="preserve">Fala sugerida:</w:t>
+      </w:r>
+      <w:r>
+        <w:t xml:space="preserve"> </w:t>
+      </w:r>
+      <w:r>
+        <w:t xml:space="preserve">Educar com intenção é escolher estar presente. Hoje falamos de presença de verdade, de ser o filtro do que chega até nossos filhos, do limite como amor e de um plano em doze passos para construir o nosso lar. O meu convite para esta semana é simples: escolha um momento por dia, sem tela, só seu e do seu filho. Pequeno, mas intencional. Muito obrigada pela presença de vocês.</w:t>
+      </w:r>
+    </w:p>
+    <w:p>
+      <w:pPr>
+        <w:pStyle w:val="BodyText"/>
+      </w:pPr>
+      <w:r>
+        <w:rPr>
+          <w:bCs/>
+          <w:b/>
+        </w:rPr>
+        <w:t xml:space="preserve">Transição:</w:t>
+      </w:r>
+      <w:r>
+        <w:t xml:space="preserve"> </w:t>
+      </w:r>
+      <w:r>
+        <w:t xml:space="preserve">E continuem com a gente nas redes.</w:t>
+      </w:r>
+    </w:p>
+    <w:p>
+      <w:r>
+        <w:pict>
+          <v:rect style="width:0;height:1.5pt" o:hralign="center" o:hrstd="t" o:hr="t"/>
+        </w:pict>
+      </w:r>
+    </w:p>
+    <w:bookmarkEnd w:id="60"/>
+    <w:bookmarkStart w:id="61" w:name="slide-42-contato-30-s"/>
+    <w:p>
+      <w:pPr>
+        <w:pStyle w:val="Heading2"/>
+      </w:pPr>
+      <w:r>
+        <w:t xml:space="preserve">Slide 42 — Contato · ⏱ 30 s</w:t>
+      </w:r>
+    </w:p>
+    <w:p>
+      <w:pPr>
+        <w:pStyle w:val="FirstParagraph"/>
+      </w:pPr>
+      <w:r>
+        <w:rPr>
+          <w:bCs/>
+          <w:b/>
+        </w:rPr>
+        <w:t xml:space="preserve">Objetivo:</w:t>
+      </w:r>
+      <w:r>
+        <w:t xml:space="preserve"> </w:t>
+      </w:r>
+      <w:r>
+        <w:t xml:space="preserve">levar os pais a acompanhar a INTEGRA.</w:t>
+      </w:r>
+    </w:p>
+    <w:p>
+      <w:pPr>
+        <w:pStyle w:val="BodyText"/>
+      </w:pPr>
+      <w:r>
+        <w:rPr>
+          <w:bCs/>
+          <w:b/>
+        </w:rPr>
+        <w:t xml:space="preserve">Abordar:</w:t>
+      </w:r>
+      <w:r>
+        <w:t xml:space="preserve"> </w:t>
+      </w:r>
+      <w:r>
+        <w:t xml:space="preserve">- Instagram</w:t>
+      </w:r>
+      <w:r>
+        <w:t xml:space="preserve"> </w:t>
+      </w:r>
+      <w:r>
+        <w:t xml:space="preserve">@integra_escoladepais</w:t>
+      </w:r>
+      <w:r>
+        <w:t xml:space="preserve"> </w:t>
+      </w:r>
+      <w:r>
+        <w:t xml:space="preserve">(QR code)</w:t>
+      </w:r>
+      <w:r>
+        <w:t xml:space="preserve"> </w:t>
+      </w:r>
+      <w:r>
+        <w:t xml:space="preserve">- WhatsApp e e-mail</w:t>
+      </w:r>
+    </w:p>
+    <w:p>
+      <w:pPr>
+        <w:pStyle w:val="BodyText"/>
+      </w:pPr>
+      <w:r>
+        <w:rPr>
+          <w:bCs/>
+          <w:b/>
+        </w:rPr>
+        <w:t xml:space="preserve">Fala sugerida:</w:t>
+      </w:r>
+      <w:r>
+        <w:t xml:space="preserve"> </w:t>
+      </w:r>
+      <w:r>
+        <w:t xml:space="preserve">Quem quiser continuar a conversa, nos siga no Instagram,</w:t>
+      </w:r>
+      <w:r>
+        <w:t xml:space="preserve"> </w:t>
+      </w:r>
+      <w:r>
+        <w:t xml:space="preserve">@integra_escoladepais</w:t>
+      </w:r>
+      <w:r>
+        <w:t xml:space="preserve">. É só apontar a câmera para o QR code. O WhatsApp e o e-mail estão aqui também. Até a próxima aula!</w:t>
+      </w:r>
+    </w:p>
+    <w:p>
+      <w:pPr>
+        <w:pStyle w:val="BodyText"/>
+      </w:pPr>
+      <w:r>
+        <w:rPr>
+          <w:bCs/>
+          <w:b/>
+        </w:rPr>
+        <w:t xml:space="preserve">Transição:</w:t>
+      </w:r>
+      <w:r>
+        <w:t xml:space="preserve"> </w:t>
+      </w:r>
+      <w:r>
+        <w:t xml:space="preserve">Mensagem final: um momento intencional por dia, sem tela, só você e seu filho.</w:t>
+      </w:r>
+    </w:p>
+    <w:p>
+      <w:r>
+        <w:pict>
+          <v:rect style="width:0;height:1.5pt" o:hralign="center" o:hrstd="t" o:hr="t"/>
+        </w:pict>
+      </w:r>
+    </w:p>
+    <w:bookmarkEnd w:id="61"/>
+    <w:bookmarkStart w:id="62" w:name="preparação-para-perguntas"/>
     <w:p>
       <w:pPr>
         <w:pStyle w:val="Heading2"/>
@@ -3740,8 +6142,8 @@
         <w:t xml:space="preserve">— Assista junto, pergunte quem ele segue e por quê, e mantenha as telas em áreas comuns da casa.</w:t>
       </w:r>
     </w:p>
-    <w:bookmarkEnd w:id="45"/>
-    <w:bookmarkEnd w:id="46"/>
+    <w:bookmarkEnd w:id="62"/>
+    <w:bookmarkEnd w:id="63"/>
     <w:sectPr/>
   </w:body>
 </w:document>

</xml_diff>